<commit_message>
docs: revisa e preenche documentacao completamente
</commit_message>
<xml_diff>
--- a/Documentacao_BugBuster.docx
+++ b/Documentacao_BugBuster.docx
@@ -6,53 +6,63 @@
       <w:pPr>
         <w:pStyle w:val="Corpo"/>
       </w:pPr>
+      <w:r/>
     </w:p>
     <w:p>
       <w:pPr>
         <w:pStyle w:val="Corpo"/>
       </w:pPr>
+      <w:r/>
     </w:p>
     <w:p>
       <w:pPr>
         <w:pStyle w:val="Corpo"/>
       </w:pPr>
+      <w:r/>
     </w:p>
     <w:p>
       <w:pPr>
         <w:pStyle w:val="Corpo"/>
       </w:pPr>
+      <w:r/>
     </w:p>
     <w:p>
       <w:pPr>
         <w:pStyle w:val="Corpo"/>
       </w:pPr>
+      <w:r/>
     </w:p>
     <w:p>
       <w:pPr>
         <w:pStyle w:val="Corpo"/>
       </w:pPr>
+      <w:r/>
     </w:p>
     <w:p>
       <w:pPr>
         <w:pStyle w:val="Corpo"/>
       </w:pPr>
+      <w:r/>
     </w:p>
     <w:p>
       <w:pPr>
         <w:pStyle w:val="Corpo"/>
       </w:pPr>
+      <w:r/>
     </w:p>
     <w:p>
       <w:pPr>
         <w:pStyle w:val="Corpo"/>
         <w:jc w:val="center"/>
       </w:pPr>
+      <w:r/>
     </w:p>
     <w:p>
       <w:pPr>
         <w:pStyle w:val="Corpo"/>
         <w:jc w:val="center"/>
       </w:pPr>
+      <w:r/>
     </w:p>
     <w:p>
       <w:pPr>
@@ -63,6 +73,7 @@
           <w:szCs w:val="52"/>
         </w:rPr>
       </w:pPr>
+      <w:r/>
     </w:p>
     <w:p>
       <w:pPr>
@@ -70,13 +81,7 @@
         <w:jc w:val="center"/>
       </w:pPr>
       <w:r>
-        <w:rPr>
-          <w:sz w:val="52"/>
-          <w:szCs w:val="52"/>
-          <w:rtl w:val="0"/>
-          <w:lang w:val="pt-PT"/>
-        </w:rPr>
-        <w:t>NOME OU SIGLA DO JOGO</w:t>
+        <w:t>BUG BUSTER</w:t>
       </w:r>
     </w:p>
     <w:p>
@@ -88,6 +93,7 @@
           <w:szCs w:val="52"/>
         </w:rPr>
       </w:pPr>
+      <w:r/>
     </w:p>
     <w:p>
       <w:pPr>
@@ -98,6 +104,7 @@
           <w:szCs w:val="52"/>
         </w:rPr>
       </w:pPr>
+      <w:r/>
     </w:p>
     <w:p>
       <w:pPr>
@@ -105,49 +112,7 @@
         <w:jc w:val="center"/>
       </w:pPr>
       <w:r>
-        <w:rPr>
-          <w:sz w:val="52"/>
-          <w:szCs w:val="52"/>
-          <w:rtl w:val="0"/>
-          <w:lang w:val="pt-PT"/>
-        </w:rPr>
-        <w:t>Documenta</w:t>
-      </w:r>
-      <w:r>
-        <w:rPr>
-          <w:sz w:val="52"/>
-          <w:szCs w:val="52"/>
-          <w:rtl w:val="0"/>
-          <w:lang w:val="pt-PT"/>
-        </w:rPr>
-        <w:t>çã</w:t>
-      </w:r>
-      <w:r>
-        <w:rPr>
-          <w:sz w:val="52"/>
-          <w:szCs w:val="52"/>
-          <w:rtl w:val="0"/>
-          <w:lang w:val="pt-PT"/>
-        </w:rPr>
-        <w:t>o da Aplica</w:t>
-      </w:r>
-      <w:r>
-        <w:rPr>
-          <w:sz w:val="52"/>
-          <w:szCs w:val="52"/>
-          <w:rtl w:val="0"/>
-          <w:lang w:val="pt-PT"/>
-        </w:rPr>
-        <w:t>çã</w:t>
-      </w:r>
-      <w:r>
-        <w:rPr>
-          <w:sz w:val="52"/>
-          <w:szCs w:val="52"/>
-          <w:rtl w:val="0"/>
-          <w:lang w:val="pt-PT"/>
-        </w:rPr>
-        <w:t>o Frontend</w:t>
+        <w:t>Documentação da Aplicação Frontend</w:t>
       </w:r>
     </w:p>
     <w:p>
@@ -159,6 +124,7 @@
           <w:szCs w:val="52"/>
         </w:rPr>
       </w:pPr>
+      <w:r/>
     </w:p>
     <w:p>
       <w:pPr>
@@ -169,6 +135,7 @@
           <w:szCs w:val="52"/>
         </w:rPr>
       </w:pPr>
+      <w:r/>
     </w:p>
     <w:p>
       <w:pPr>
@@ -180,30 +147,7 @@
         </w:rPr>
       </w:pPr>
       <w:r>
-        <w:rPr>
-          <w:sz w:val="52"/>
-          <w:szCs w:val="52"/>
-          <w:rtl w:val="0"/>
-          <w:lang w:val="de-DE"/>
-        </w:rPr>
-        <w:t>Vers</w:t>
-      </w:r>
-      <w:r>
-        <w:rPr>
-          <w:sz w:val="52"/>
-          <w:szCs w:val="52"/>
-          <w:rtl w:val="0"/>
-          <w:lang w:val="pt-PT"/>
-        </w:rPr>
-        <w:t>ã</w:t>
-      </w:r>
-      <w:r>
-        <w:rPr>
-          <w:sz w:val="52"/>
-          <w:szCs w:val="52"/>
-          <w:rtl w:val="0"/>
-        </w:rPr>
-        <w:t>o 1.0</w:t>
+        <w:t>Versão 1.0</w:t>
       </w:r>
     </w:p>
     <w:p>
@@ -215,6 +159,7 @@
           <w:szCs w:val="52"/>
         </w:rPr>
       </w:pPr>
+      <w:r/>
     </w:p>
     <w:p>
       <w:pPr>
@@ -225,6 +170,7 @@
           <w:szCs w:val="52"/>
         </w:rPr>
       </w:pPr>
+      <w:r/>
     </w:p>
     <w:p>
       <w:pPr>
@@ -235,6 +181,7 @@
           <w:szCs w:val="52"/>
         </w:rPr>
       </w:pPr>
+      <w:r/>
     </w:p>
     <w:p>
       <w:pPr>
@@ -245,6 +192,7 @@
           <w:szCs w:val="52"/>
         </w:rPr>
       </w:pPr>
+      <w:r/>
     </w:p>
     <w:p>
       <w:pPr>
@@ -255,6 +203,7 @@
           <w:szCs w:val="52"/>
         </w:rPr>
       </w:pPr>
+      <w:r/>
     </w:p>
     <w:p>
       <w:pPr>
@@ -266,19 +215,7 @@
         </w:rPr>
       </w:pPr>
       <w:r>
-        <w:rPr>
-          <w:sz w:val="52"/>
-          <w:szCs w:val="52"/>
-        </w:rPr>
         <w:tab/>
-      </w:r>
-      <w:r>
-        <w:rPr>
-          <w:sz w:val="28"/>
-          <w:szCs w:val="28"/>
-          <w:rtl w:val="0"/>
-          <w:lang w:val="pt-PT"/>
-        </w:rPr>
         <w:t>Taguatinga-DF, 22 de abril de 2026.</w:t>
       </w:r>
     </w:p>
@@ -292,126 +229,48 @@
           <w:szCs w:val="52"/>
         </w:rPr>
       </w:pPr>
+      <w:r/>
     </w:p>
     <w:p>
       <w:pPr>
         <w:pStyle w:val="Corpo"/>
         <w:spacing w:after="200" w:line="276" w:lineRule="auto"/>
       </w:pPr>
+      <w:r/>
     </w:p>
     <w:p>
       <w:pPr>
         <w:pStyle w:val="heading 1"/>
         <w:jc w:val="center"/>
       </w:pPr>
-      <w:bookmarkStart w:name="_Toc" w:id="0"/>
-      <w:r>
-        <w:rPr>
-          <w:rtl w:val="0"/>
-          <w:lang w:val="pt-PT"/>
-        </w:rPr>
-        <w:t>Sum</w:t>
-      </w:r>
-      <w:r>
-        <w:rPr>
-          <w:rtl w:val="0"/>
-          <w:lang w:val="pt-PT"/>
-        </w:rPr>
-        <w:t>á</w:t>
-      </w:r>
-      <w:r>
-        <w:rPr>
-          <w:rtl w:val="0"/>
-          <w:lang w:val="pt-PT"/>
-        </w:rPr>
-        <w:t>rio</w:t>
-      </w:r>
-      <w:bookmarkEnd w:id="0"/>
+      <w:r>
+        <w:t>Sumário</w:t>
+      </w:r>
     </w:p>
     <w:p>
       <w:pPr>
         <w:pStyle w:val="Corpo"/>
       </w:pPr>
-      <w:r>
-        <w:rPr/>
-        <w:fldChar w:fldCharType="begin" w:fldLock="0"/>
-      </w:r>
-      <w:r>
-        <w:instrText xml:space="preserve"> TOC \t "heading 1, 1"</w:instrText>
-      </w:r>
-      <w:r>
-        <w:rPr/>
-        <w:fldChar w:fldCharType="separate" w:fldLock="0"/>
-      </w:r>
+      <w:r/>
     </w:p>
     <w:p>
       <w:pPr>
         <w:pStyle w:val="TOC 1"/>
       </w:pPr>
       <w:r>
-        <w:rPr>
-          <w:rFonts w:cs="Arial Unicode MS" w:eastAsia="Arial Unicode MS" w:hint="default"/>
-          <w:rtl w:val="0"/>
-        </w:rPr>
         <w:t>Sumário</w:t>
         <w:tab/>
-      </w:r>
-      <w:r>
-        <w:rPr/>
-        <w:fldChar w:fldCharType="begin" w:fldLock="0"/>
-      </w:r>
-      <w:r>
-        <w:instrText xml:space="preserve"> PAGEREF _Toc \h </w:instrText>
-      </w:r>
-      <w:r>
-        <w:rPr/>
-        <w:fldChar w:fldCharType="separate" w:fldLock="0"/>
-      </w:r>
-      <w:r>
-        <w:rPr>
-          <w:rFonts w:cs="Arial Unicode MS" w:eastAsia="Arial Unicode MS"/>
-          <w:rtl w:val="0"/>
-        </w:rPr>
         <w:t>2</w:t>
       </w:r>
-      <w:r>
-        <w:rPr/>
-        <w:fldChar w:fldCharType="end" w:fldLock="0"/>
-      </w:r>
     </w:p>
     <w:p>
       <w:pPr>
         <w:pStyle w:val="TOC 1"/>
       </w:pPr>
       <w:r>
-        <w:rPr>
-          <w:rFonts w:cs="Arial Unicode MS" w:eastAsia="Arial Unicode MS"/>
-          <w:rtl w:val="0"/>
-        </w:rPr>
         <w:t>Componentes do Grupo</w:t>
         <w:tab/>
-      </w:r>
-      <w:r>
-        <w:rPr/>
-        <w:fldChar w:fldCharType="begin" w:fldLock="0"/>
-      </w:r>
-      <w:r>
-        <w:instrText xml:space="preserve"> PAGEREF _Toc1 \h </w:instrText>
-      </w:r>
-      <w:r>
-        <w:rPr/>
-        <w:fldChar w:fldCharType="separate" w:fldLock="0"/>
-      </w:r>
-      <w:r>
-        <w:rPr>
-          <w:rFonts w:cs="Arial Unicode MS" w:eastAsia="Arial Unicode MS"/>
-          <w:rtl w:val="0"/>
-        </w:rPr>
         <w:t>3</w:t>
-      </w:r>
-      <w:r>
-        <w:rPr/>
-        <w:fldChar w:fldCharType="end" w:fldLock="0"/>
       </w:r>
     </w:p>
     <w:p>
@@ -423,34 +282,9 @@
         </w:numPr>
       </w:pPr>
       <w:r>
-        <w:rPr>
-          <w:rFonts w:cs="Arial Unicode MS" w:eastAsia="Arial Unicode MS" w:hint="default"/>
-          <w:rtl w:val="0"/>
-        </w:rPr>
         <w:t>Introdução</w:t>
         <w:tab/>
-      </w:r>
-      <w:r>
-        <w:rPr/>
-        <w:fldChar w:fldCharType="begin" w:fldLock="0"/>
-      </w:r>
-      <w:r>
-        <w:instrText xml:space="preserve"> PAGEREF _Toc2 \h </w:instrText>
-      </w:r>
-      <w:r>
-        <w:rPr/>
-        <w:fldChar w:fldCharType="separate" w:fldLock="0"/>
-      </w:r>
-      <w:r>
-        <w:rPr>
-          <w:rFonts w:cs="Arial Unicode MS" w:eastAsia="Arial Unicode MS"/>
-          <w:rtl w:val="0"/>
-        </w:rPr>
         <w:t>4</w:t>
-      </w:r>
-      <w:r>
-        <w:rPr/>
-        <w:fldChar w:fldCharType="end" w:fldLock="0"/>
       </w:r>
     </w:p>
     <w:p>
@@ -462,34 +296,9 @@
         </w:numPr>
       </w:pPr>
       <w:r>
-        <w:rPr>
-          <w:rFonts w:cs="Arial Unicode MS" w:eastAsia="Arial Unicode MS" w:hint="default"/>
-          <w:rtl w:val="0"/>
-        </w:rPr>
         <w:t>Visão Geral do Jogo</w:t>
         <w:tab/>
-      </w:r>
-      <w:r>
-        <w:rPr/>
-        <w:fldChar w:fldCharType="begin" w:fldLock="0"/>
-      </w:r>
-      <w:r>
-        <w:instrText xml:space="preserve"> PAGEREF _Toc3 \h </w:instrText>
-      </w:r>
-      <w:r>
-        <w:rPr/>
-        <w:fldChar w:fldCharType="separate" w:fldLock="0"/>
-      </w:r>
-      <w:r>
-        <w:rPr>
-          <w:rFonts w:cs="Arial Unicode MS" w:eastAsia="Arial Unicode MS"/>
-          <w:rtl w:val="0"/>
-        </w:rPr>
         <w:t>4</w:t>
-      </w:r>
-      <w:r>
-        <w:rPr/>
-        <w:fldChar w:fldCharType="end" w:fldLock="0"/>
       </w:r>
     </w:p>
     <w:p>
@@ -501,34 +310,9 @@
         </w:numPr>
       </w:pPr>
       <w:r>
-        <w:rPr>
-          <w:rFonts w:cs="Arial Unicode MS" w:eastAsia="Arial Unicode MS" w:hint="default"/>
-          <w:rtl w:val="0"/>
-        </w:rPr>
         <w:t>Abreviações e Siglas</w:t>
         <w:tab/>
-      </w:r>
-      <w:r>
-        <w:rPr/>
-        <w:fldChar w:fldCharType="begin" w:fldLock="0"/>
-      </w:r>
-      <w:r>
-        <w:instrText xml:space="preserve"> PAGEREF _Toc4 \h </w:instrText>
-      </w:r>
-      <w:r>
-        <w:rPr/>
-        <w:fldChar w:fldCharType="separate" w:fldLock="0"/>
-      </w:r>
-      <w:r>
-        <w:rPr>
-          <w:rFonts w:cs="Arial Unicode MS" w:eastAsia="Arial Unicode MS"/>
-          <w:rtl w:val="0"/>
-        </w:rPr>
         <w:t>4</w:t>
-      </w:r>
-      <w:r>
-        <w:rPr/>
-        <w:fldChar w:fldCharType="end" w:fldLock="0"/>
       </w:r>
     </w:p>
     <w:p>
@@ -540,34 +324,9 @@
         </w:numPr>
       </w:pPr>
       <w:r>
-        <w:rPr>
-          <w:rFonts w:cs="Arial Unicode MS" w:eastAsia="Arial Unicode MS" w:hint="default"/>
-          <w:rtl w:val="0"/>
-        </w:rPr>
         <w:t>Envolvidos e Usuários</w:t>
         <w:tab/>
-      </w:r>
-      <w:r>
-        <w:rPr/>
-        <w:fldChar w:fldCharType="begin" w:fldLock="0"/>
-      </w:r>
-      <w:r>
-        <w:instrText xml:space="preserve"> PAGEREF _Toc5 \h </w:instrText>
-      </w:r>
-      <w:r>
-        <w:rPr/>
-        <w:fldChar w:fldCharType="separate" w:fldLock="0"/>
-      </w:r>
-      <w:r>
-        <w:rPr>
-          <w:rFonts w:cs="Arial Unicode MS" w:eastAsia="Arial Unicode MS"/>
-          <w:rtl w:val="0"/>
-        </w:rPr>
         <w:t>5</w:t>
-      </w:r>
-      <w:r>
-        <w:rPr/>
-        <w:fldChar w:fldCharType="end" w:fldLock="0"/>
       </w:r>
     </w:p>
     <w:p>
@@ -579,34 +338,9 @@
         </w:numPr>
       </w:pPr>
       <w:r>
-        <w:rPr>
-          <w:rFonts w:cs="Arial Unicode MS" w:eastAsia="Arial Unicode MS" w:hint="default"/>
-          <w:rtl w:val="0"/>
-        </w:rPr>
         <w:t>Requisitos da Aplicação Frontend</w:t>
         <w:tab/>
-      </w:r>
-      <w:r>
-        <w:rPr/>
-        <w:fldChar w:fldCharType="begin" w:fldLock="0"/>
-      </w:r>
-      <w:r>
-        <w:instrText xml:space="preserve"> PAGEREF _Toc6 \h </w:instrText>
-      </w:r>
-      <w:r>
-        <w:rPr/>
-        <w:fldChar w:fldCharType="separate" w:fldLock="0"/>
-      </w:r>
-      <w:r>
-        <w:rPr>
-          <w:rFonts w:cs="Arial Unicode MS" w:eastAsia="Arial Unicode MS"/>
-          <w:rtl w:val="0"/>
-        </w:rPr>
         <w:t>5</w:t>
-      </w:r>
-      <w:r>
-        <w:rPr/>
-        <w:fldChar w:fldCharType="end" w:fldLock="0"/>
       </w:r>
     </w:p>
     <w:p>
@@ -618,34 +352,9 @@
         </w:numPr>
       </w:pPr>
       <w:r>
-        <w:rPr>
-          <w:rFonts w:cs="Arial Unicode MS" w:eastAsia="Arial Unicode MS"/>
-          <w:rtl w:val="0"/>
-        </w:rPr>
         <w:t>Funcionais</w:t>
         <w:tab/>
-      </w:r>
-      <w:r>
-        <w:rPr/>
-        <w:fldChar w:fldCharType="begin" w:fldLock="0"/>
-      </w:r>
-      <w:r>
-        <w:instrText xml:space="preserve"> PAGEREF _Toc7 \h </w:instrText>
-      </w:r>
-      <w:r>
-        <w:rPr/>
-        <w:fldChar w:fldCharType="separate" w:fldLock="0"/>
-      </w:r>
-      <w:r>
-        <w:rPr>
-          <w:rFonts w:cs="Arial Unicode MS" w:eastAsia="Arial Unicode MS"/>
-          <w:rtl w:val="0"/>
-        </w:rPr>
         <w:t>5</w:t>
-      </w:r>
-      <w:r>
-        <w:rPr/>
-        <w:fldChar w:fldCharType="end" w:fldLock="0"/>
       </w:r>
     </w:p>
     <w:p>
@@ -657,34 +366,9 @@
         </w:numPr>
       </w:pPr>
       <w:r>
-        <w:rPr>
-          <w:rFonts w:cs="Arial Unicode MS" w:eastAsia="Arial Unicode MS" w:hint="default"/>
-          <w:rtl w:val="0"/>
-        </w:rPr>
         <w:t>Não-Funcionais</w:t>
         <w:tab/>
-      </w:r>
-      <w:r>
-        <w:rPr/>
-        <w:fldChar w:fldCharType="begin" w:fldLock="0"/>
-      </w:r>
-      <w:r>
-        <w:instrText xml:space="preserve"> PAGEREF _Toc8 \h </w:instrText>
-      </w:r>
-      <w:r>
-        <w:rPr/>
-        <w:fldChar w:fldCharType="separate" w:fldLock="0"/>
-      </w:r>
-      <w:r>
-        <w:rPr>
-          <w:rFonts w:cs="Arial Unicode MS" w:eastAsia="Arial Unicode MS"/>
-          <w:rtl w:val="0"/>
-        </w:rPr>
         <w:t>5</w:t>
-      </w:r>
-      <w:r>
-        <w:rPr/>
-        <w:fldChar w:fldCharType="end" w:fldLock="0"/>
       </w:r>
     </w:p>
     <w:p>
@@ -696,34 +380,9 @@
         </w:numPr>
       </w:pPr>
       <w:r>
-        <w:rPr>
-          <w:rFonts w:cs="Arial Unicode MS" w:eastAsia="Arial Unicode MS" w:hint="default"/>
-          <w:rtl w:val="0"/>
-        </w:rPr>
         <w:t>Regras de Negócio</w:t>
         <w:tab/>
-      </w:r>
-      <w:r>
-        <w:rPr/>
-        <w:fldChar w:fldCharType="begin" w:fldLock="0"/>
-      </w:r>
-      <w:r>
-        <w:instrText xml:space="preserve"> PAGEREF _Toc9 \h </w:instrText>
-      </w:r>
-      <w:r>
-        <w:rPr/>
-        <w:fldChar w:fldCharType="separate" w:fldLock="0"/>
-      </w:r>
-      <w:r>
-        <w:rPr>
-          <w:rFonts w:cs="Arial Unicode MS" w:eastAsia="Arial Unicode MS"/>
-          <w:rtl w:val="0"/>
-        </w:rPr>
         <w:t>6</w:t>
-      </w:r>
-      <w:r>
-        <w:rPr/>
-        <w:fldChar w:fldCharType="end" w:fldLock="0"/>
       </w:r>
     </w:p>
     <w:p>
@@ -735,91 +394,71 @@
         </w:numPr>
       </w:pPr>
       <w:r>
-        <w:rPr>
-          <w:rFonts w:cs="Arial Unicode MS" w:eastAsia="Arial Unicode MS" w:hint="default"/>
-          <w:rtl w:val="0"/>
-        </w:rPr>
         <w:t>Anexos (Telas do Jogo, Endereço do GitHub e Documentos Auxiliares)</w:t>
         <w:tab/>
-      </w:r>
-      <w:r>
-        <w:rPr/>
-        <w:fldChar w:fldCharType="begin" w:fldLock="0"/>
-      </w:r>
-      <w:r>
-        <w:instrText xml:space="preserve"> PAGEREF _Toc10 \h </w:instrText>
-      </w:r>
-      <w:r>
-        <w:rPr/>
-        <w:fldChar w:fldCharType="separate" w:fldLock="0"/>
-      </w:r>
-      <w:r>
-        <w:rPr>
-          <w:rFonts w:cs="Arial Unicode MS" w:eastAsia="Arial Unicode MS"/>
-          <w:rtl w:val="0"/>
-        </w:rPr>
         <w:t>7</w:t>
       </w:r>
-      <w:r>
-        <w:rPr/>
-        <w:fldChar w:fldCharType="end" w:fldLock="0"/>
-      </w:r>
     </w:p>
     <w:p>
       <w:pPr>
         <w:pStyle w:val="Corpo"/>
       </w:pPr>
-      <w:r>
-        <w:rPr/>
-        <w:fldChar w:fldCharType="end" w:fldLock="0"/>
-      </w:r>
+      <w:r/>
     </w:p>
     <w:p>
       <w:pPr>
         <w:pStyle w:val="Corpo"/>
       </w:pPr>
+      <w:r/>
     </w:p>
     <w:p>
       <w:pPr>
         <w:pStyle w:val="Corpo"/>
         <w:spacing w:after="200" w:line="276" w:lineRule="auto"/>
       </w:pPr>
+      <w:r/>
     </w:p>
     <w:p>
       <w:pPr>
         <w:pStyle w:val="Corpo"/>
         <w:spacing w:after="200" w:line="276" w:lineRule="auto"/>
       </w:pPr>
+      <w:r/>
     </w:p>
     <w:p>
       <w:pPr>
         <w:pStyle w:val="Corpo"/>
         <w:spacing w:after="200" w:line="276" w:lineRule="auto"/>
       </w:pPr>
+      <w:r/>
     </w:p>
     <w:p>
       <w:pPr>
         <w:pStyle w:val="Corpo"/>
         <w:spacing w:after="200" w:line="276" w:lineRule="auto"/>
       </w:pPr>
+      <w:r/>
     </w:p>
     <w:p>
       <w:pPr>
         <w:pStyle w:val="Corpo"/>
         <w:spacing w:after="200" w:line="276" w:lineRule="auto"/>
       </w:pPr>
+      <w:r/>
     </w:p>
     <w:p>
       <w:pPr>
         <w:pStyle w:val="Corpo"/>
         <w:spacing w:after="200" w:line="276" w:lineRule="auto"/>
       </w:pPr>
+      <w:r/>
     </w:p>
     <w:p>
       <w:pPr>
         <w:pStyle w:val="Corpo"/>
         <w:spacing w:after="200" w:line="276" w:lineRule="auto"/>
       </w:pPr>
+      <w:r/>
     </w:p>
     <w:p>
       <w:pPr>
@@ -827,16 +466,7 @@
         <w:spacing w:line="276" w:lineRule="auto"/>
         <w:jc w:val="both"/>
       </w:pPr>
-      <w:r>
-        <w:rPr>
-          <w:rFonts w:ascii="Arial Unicode MS" w:cs="Arial Unicode MS" w:hAnsi="Arial Unicode MS" w:eastAsia="Arial Unicode MS"/>
-          <w:b w:val="0"/>
-          <w:bCs w:val="0"/>
-          <w:i w:val="0"/>
-          <w:iCs w:val="0"/>
-        </w:rPr>
-        <w:br w:type="page"/>
-      </w:r>
+      <w:r/>
     </w:p>
     <w:p>
       <w:pPr>
@@ -844,15 +474,9 @@
         <w:spacing w:line="276" w:lineRule="auto"/>
         <w:jc w:val="both"/>
       </w:pPr>
-      <w:bookmarkStart w:name="_Toc1" w:id="1"/>
-      <w:r>
-        <w:rPr>
-          <w:rtl w:val="0"/>
-          <w:lang w:val="pt-PT"/>
-        </w:rPr>
+      <w:r>
         <w:t>Componentes do Grupo</w:t>
       </w:r>
-      <w:bookmarkEnd w:id="1"/>
     </w:p>
     <w:p>
       <w:pPr>
@@ -860,6 +484,7 @@
         <w:spacing w:line="276" w:lineRule="auto"/>
         <w:jc w:val="both"/>
       </w:pPr>
+      <w:r/>
     </w:p>
     <w:tbl>
       <w:tblPr>
@@ -913,34 +538,7 @@
               <w:jc w:val="center"/>
             </w:pPr>
             <w:r>
-              <w:rPr>
-                <w:b w:val="1"/>
-                <w:bCs w:val="1"/>
-                <w:shd w:val="nil" w:color="auto" w:fill="auto"/>
-                <w:rtl w:val="0"/>
-                <w:lang w:val="pt-PT"/>
-              </w:rPr>
-              <w:t>Matr</w:t>
-            </w:r>
-            <w:r>
-              <w:rPr>
-                <w:b w:val="1"/>
-                <w:bCs w:val="1"/>
-                <w:shd w:val="nil" w:color="auto" w:fill="auto"/>
-                <w:rtl w:val="0"/>
-                <w:lang w:val="pt-PT"/>
-              </w:rPr>
-              <w:t>í</w:t>
-            </w:r>
-            <w:r>
-              <w:rPr>
-                <w:b w:val="1"/>
-                <w:bCs w:val="1"/>
-                <w:shd w:val="nil" w:color="auto" w:fill="auto"/>
-                <w:rtl w:val="0"/>
-                <w:lang w:val="pt-PT"/>
-              </w:rPr>
-              <w:t>culas</w:t>
+              <w:t>Matrículas</w:t>
             </w:r>
           </w:p>
         </w:tc>
@@ -969,13 +567,6 @@
               <w:jc w:val="both"/>
             </w:pPr>
             <w:r>
-              <w:rPr>
-                <w:b w:val="1"/>
-                <w:bCs w:val="1"/>
-                <w:shd w:val="nil" w:color="auto" w:fill="auto"/>
-                <w:rtl w:val="0"/>
-                <w:lang w:val="pt-PT"/>
-              </w:rPr>
               <w:t>Nomes</w:t>
             </w:r>
           </w:p>
@@ -1013,12 +604,7 @@
               <w:jc w:val="center"/>
             </w:pPr>
             <w:r>
-              <w:rPr>
-                <w:shd w:val="nil" w:color="auto" w:fill="auto"/>
-                <w:rtl w:val="0"/>
-                <w:lang w:val="pt-PT"/>
-              </w:rPr>
-              <w:t>999999999</w:t>
+              <w:t>[Sua Matrícula Aqui]</w:t>
             </w:r>
           </w:p>
         </w:tc>
@@ -1047,12 +633,7 @@
               <w:jc w:val="both"/>
             </w:pPr>
             <w:r>
-              <w:rPr>
-                <w:shd w:val="nil" w:color="auto" w:fill="auto"/>
-                <w:rtl w:val="0"/>
-                <w:lang w:val="pt-PT"/>
-              </w:rPr>
-              <w:t>XXXXXXXXXXXXXXXXXXX</w:t>
+              <w:t>Kauã (kauaxp77)</w:t>
             </w:r>
           </w:p>
         </w:tc>
@@ -1089,12 +670,7 @@
               <w:jc w:val="center"/>
             </w:pPr>
             <w:r>
-              <w:rPr>
-                <w:shd w:val="nil" w:color="auto" w:fill="auto"/>
-                <w:rtl w:val="0"/>
-                <w:lang w:val="pt-PT"/>
-              </w:rPr>
-              <w:t>999999999</w:t>
+              <w:t>[Sua Matrícula Aqui]</w:t>
             </w:r>
           </w:p>
         </w:tc>
@@ -1123,12 +699,7 @@
               <w:jc w:val="both"/>
             </w:pPr>
             <w:r>
-              <w:rPr>
-                <w:shd w:val="nil" w:color="auto" w:fill="auto"/>
-                <w:rtl w:val="0"/>
-                <w:lang w:val="pt-PT"/>
-              </w:rPr>
-              <w:t>XXXXXXXXXXXXXXXXXXX</w:t>
+              <w:t>Kauã (kauaxp77)</w:t>
             </w:r>
           </w:p>
         </w:tc>
@@ -1142,6 +713,7 @@
         <w:ind w:left="271" w:hanging="271"/>
         <w:jc w:val="both"/>
       </w:pPr>
+      <w:r/>
     </w:p>
     <w:p>
       <w:pPr>
@@ -1150,6 +722,7 @@
         <w:spacing w:line="240" w:lineRule="auto"/>
         <w:ind w:left="163" w:hanging="163"/>
       </w:pPr>
+      <w:r/>
     </w:p>
     <w:p>
       <w:pPr>
@@ -1169,6 +742,7 @@
           <w:bidi w:val="0"/>
         </w:sectPr>
       </w:pPr>
+      <w:r/>
     </w:p>
     <w:p>
       <w:pPr>
@@ -1189,35 +763,9 @@
           <w:rtl w:val="0"/>
         </w:rPr>
       </w:pPr>
-      <w:bookmarkStart w:name="_Toc2" w:id="2"/>
-      <w:r>
-        <w:rPr>
-          <w:sz w:val="36"/>
-          <w:szCs w:val="36"/>
-          <w:rtl w:val="0"/>
-          <w:lang w:val="pt-PT"/>
-        </w:rPr>
-        <w:t>Introdu</w:t>
-      </w:r>
-      <w:r>
-        <w:rPr>
-          <w:sz w:val="36"/>
-          <w:szCs w:val="36"/>
-          <w:rtl w:val="0"/>
-          <w:lang w:val="pt-PT"/>
-        </w:rPr>
-        <w:t>çã</w:t>
-      </w:r>
-      <w:r>
-        <w:rPr>
-          <w:sz w:val="36"/>
-          <w:szCs w:val="36"/>
-          <w:rtl w:val="0"/>
-          <w:lang w:val="pt-PT"/>
-        </w:rPr>
-        <w:t>o</w:t>
-      </w:r>
-      <w:bookmarkEnd w:id="2"/>
+      <w:r>
+        <w:t>Introdução</w:t>
+      </w:r>
     </w:p>
     <w:p>
       <w:pPr>
@@ -1227,7 +775,13 @@
         <w:jc w:val="both"/>
       </w:pPr>
       <w:r>
-        <w:t>Bug Buster é um jogo em 2D de visão superior inspirado em mecânicas clássicas de fliperama, focado na temática de programação e TI. O jogador controla um programador com a missão de percorrer um servidor coletando linhas de código enquanto tenta fugir de ameaças virtuais cibernéticas. O ambiente de jogo foi desenvolvido em JavaScript Vanilla e renderizado puramente na tag Canvas do HTML5.</w:t>
+        <w:t>Bug Buster é um jogo em 2D de visão superior inspirado em mecânicas clássicas de fliperama, focado na temática de programação. O jogador controla um programador com a missão de percorrer um servidor coletando linhas de código (pontos) enquanto foge de ameaças virtuais.</w:t>
+        <w:br/>
+        <w:br/>
+        <w:t>As dinâmicas principais envolvem desvios e power-ups temporários (representados por uma caneca de café) que conferem ao jogador imunidade de curto prazo. Para enriquecer a sensação de jogo, efeitos visuais de luz em estilo Neon (Cyberpunk) e sons dinâmicos foram incorporados em tempo real usando a Web Audio API.</w:t>
+        <w:br/>
+        <w:br/>
+        <w:t>Esta aplicação demonstra a manipulação eficiente de matrizes lógicas para construir labirintos e a separação de conceitos de código através do padrão que isola a renderização da lógica.</w:t>
       </w:r>
     </w:p>
     <w:p>
@@ -1264,6 +818,7 @@
         <w:ind w:firstLine="360"/>
         <w:jc w:val="both"/>
       </w:pPr>
+      <w:r/>
     </w:p>
     <w:p>
       <w:pPr>
@@ -1284,35 +839,9 @@
           <w:rtl w:val="0"/>
         </w:rPr>
       </w:pPr>
-      <w:bookmarkStart w:name="_Toc3" w:id="3"/>
-      <w:r>
-        <w:rPr>
-          <w:sz w:val="36"/>
-          <w:szCs w:val="36"/>
-          <w:rtl w:val="0"/>
-          <w:lang w:val="pt-PT"/>
-        </w:rPr>
-        <w:t>Vis</w:t>
-      </w:r>
-      <w:r>
-        <w:rPr>
-          <w:sz w:val="36"/>
-          <w:szCs w:val="36"/>
-          <w:rtl w:val="0"/>
-          <w:lang w:val="pt-PT"/>
-        </w:rPr>
-        <w:t>ã</w:t>
-      </w:r>
-      <w:r>
-        <w:rPr>
-          <w:sz w:val="36"/>
-          <w:szCs w:val="36"/>
-          <w:rtl w:val="0"/>
-          <w:lang w:val="pt-PT"/>
-        </w:rPr>
-        <w:t>o Geral do Jogo</w:t>
-      </w:r>
-      <w:bookmarkEnd w:id="3"/>
+      <w:r>
+        <w:t>Visão Geral do Jogo</w:t>
+      </w:r>
     </w:p>
     <w:p>
       <w:pPr>
@@ -1322,7 +851,7 @@
         <w:jc w:val="both"/>
       </w:pPr>
       <w:r>
-        <w:t>O jogador comanda um bloco azul ('O Programador') dentro de um labirinto fechado que possui limites elásticos em suas extremidades laterais (Túneis de Rede). O objetivo primário é limpar o tabuleiro de dados brutos sem ser tocado pelo Ransomware e o Spyware, avançando para níveis superiores e pontuando ao máximo.</w:t>
+        <w:t>O jogador comanda um bloco azul ('O Programador') dentro de um labirinto fechado que possui limites elásticos em suas extremidades laterais (Túneis de Rede). O objetivo primário é limpar o tabuleiro de dados sem ser tocado pelo Ransomware e pelo Spyware.</w:t>
       </w:r>
     </w:p>
     <w:p>
@@ -1341,6 +870,7 @@
         <w:ind w:firstLine="360"/>
         <w:jc w:val="both"/>
       </w:pPr>
+      <w:r/>
     </w:p>
     <w:p>
       <w:pPr>
@@ -1361,35 +891,9 @@
           <w:rtl w:val="0"/>
         </w:rPr>
       </w:pPr>
-      <w:bookmarkStart w:name="_Toc4" w:id="4"/>
-      <w:r>
-        <w:rPr>
-          <w:sz w:val="36"/>
-          <w:szCs w:val="36"/>
-          <w:rtl w:val="0"/>
-          <w:lang w:val="pt-PT"/>
-        </w:rPr>
-        <w:t>Abrevia</w:t>
-      </w:r>
-      <w:r>
-        <w:rPr>
-          <w:sz w:val="36"/>
-          <w:szCs w:val="36"/>
-          <w:rtl w:val="0"/>
-          <w:lang w:val="pt-PT"/>
-        </w:rPr>
-        <w:t>çõ</w:t>
-      </w:r>
-      <w:r>
-        <w:rPr>
-          <w:sz w:val="36"/>
-          <w:szCs w:val="36"/>
-          <w:rtl w:val="0"/>
-          <w:lang w:val="pt-PT"/>
-        </w:rPr>
-        <w:t>es e Siglas</w:t>
-      </w:r>
-      <w:bookmarkEnd w:id="4"/>
+      <w:r>
+        <w:t>Abreviações e Siglas</w:t>
+      </w:r>
     </w:p>
     <w:p>
       <w:pPr>
@@ -1405,25 +909,7 @@
         </w:rPr>
       </w:pPr>
       <w:r>
-        <w:rPr>
-          <w:rtl w:val="0"/>
-          <w:lang w:val="pt-PT"/>
-        </w:rPr>
-        <w:t xml:space="preserve">BD </w:t>
-      </w:r>
-      <w:r>
-        <w:rPr>
-          <w:rtl w:val="0"/>
-          <w:lang w:val="pt-PT"/>
-        </w:rPr>
-        <w:t xml:space="preserve">– </w:t>
-      </w:r>
-      <w:r>
-        <w:rPr>
-          <w:rtl w:val="0"/>
-          <w:lang w:val="pt-PT"/>
-        </w:rPr>
-        <w:t>Banco de Dados;</w:t>
+        <w:t>BD – Banco de Dados;</w:t>
       </w:r>
     </w:p>
     <w:p>
@@ -1439,7 +925,9 @@
           <w:lang w:val="pt-PT"/>
         </w:rPr>
       </w:pPr>
-      <w:r/>
+      <w:r>
+        <w:t>xxx – xxxxxxxxxxxxxxxxxxxxxxxxxxxx;</w:t>
+      </w:r>
     </w:p>
     <w:p>
       <w:pPr>
@@ -1454,7 +942,9 @@
           <w:lang w:val="pt-PT"/>
         </w:rPr>
       </w:pPr>
-      <w:r/>
+      <w:r>
+        <w:t>xxxx – xxxxxxxxxxxxxxxxxxxxxxxxxxx;</w:t>
+      </w:r>
     </w:p>
     <w:p>
       <w:pPr>
@@ -1469,7 +959,9 @@
           <w:lang w:val="pt-PT"/>
         </w:rPr>
       </w:pPr>
-      <w:r/>
+      <w:r>
+        <w:t>xxxx – xxxxxxxxxxxxxxxxxxxxxxxxxxx;</w:t>
+      </w:r>
     </w:p>
     <w:p>
       <w:pPr>
@@ -1484,7 +976,9 @@
           <w:lang w:val="pt-PT"/>
         </w:rPr>
       </w:pPr>
-      <w:r/>
+      <w:r>
+        <w:t>xxxxx – xxxxxxxxxxxxxxxxxxxxxxxxxx;</w:t>
+      </w:r>
     </w:p>
     <w:p>
       <w:pPr>
@@ -1505,35 +999,9 @@
           <w:rtl w:val="0"/>
         </w:rPr>
       </w:pPr>
-      <w:bookmarkStart w:name="_Toc5" w:id="5"/>
-      <w:r>
-        <w:rPr>
-          <w:sz w:val="36"/>
-          <w:szCs w:val="36"/>
-          <w:rtl w:val="0"/>
-          <w:lang w:val="pt-PT"/>
-        </w:rPr>
-        <w:t>Envolvidos e Usu</w:t>
-      </w:r>
-      <w:r>
-        <w:rPr>
-          <w:sz w:val="36"/>
-          <w:szCs w:val="36"/>
-          <w:rtl w:val="0"/>
-          <w:lang w:val="pt-PT"/>
-        </w:rPr>
-        <w:t>á</w:t>
-      </w:r>
-      <w:r>
-        <w:rPr>
-          <w:sz w:val="36"/>
-          <w:szCs w:val="36"/>
-          <w:rtl w:val="0"/>
-          <w:lang w:val="pt-PT"/>
-        </w:rPr>
-        <w:t>rios</w:t>
-      </w:r>
-      <w:bookmarkEnd w:id="5"/>
+      <w:r>
+        <w:t>Envolvidos e Usuários</w:t>
+      </w:r>
     </w:p>
     <w:p>
       <w:pPr>
@@ -1541,6 +1009,7 @@
         <w:spacing w:line="360" w:lineRule="auto"/>
         <w:jc w:val="both"/>
       </w:pPr>
+      <w:r/>
     </w:p>
     <w:p>
       <w:pPr>
@@ -1550,7 +1019,7 @@
         <w:jc w:val="both"/>
       </w:pPr>
       <w:r>
-        <w:t>Os envolvidos no projeto englobam os desenvolvedores Frontend responsáveis pelo Game Design, arquitetura da interface, testes e integração de áudio/gráficos em Canvas. O perfil de usuário alvo atinge desde jogadores casuais que buscam um jogo rápido no navegador até entusiastas de TI e programação.</w:t>
+        <w:t>Os envolvidos no projeto englobam os desenvolvedores Frontend responsáveis pelo Game Design, arquitetura da interface, testes e integração em Canvas. O perfil de usuário alvo atinge desde jogadores casuais que buscam um jogo rápido no navegador até entusiastas de TI.</w:t>
       </w:r>
     </w:p>
     <w:p>
@@ -1559,6 +1028,7 @@
         <w:spacing w:line="360" w:lineRule="auto"/>
         <w:jc w:val="both"/>
       </w:pPr>
+      <w:r/>
     </w:p>
     <w:p>
       <w:pPr>
@@ -1579,35 +1049,9 @@
           <w:rtl w:val="0"/>
         </w:rPr>
       </w:pPr>
-      <w:bookmarkStart w:name="_Toc6" w:id="6"/>
-      <w:r>
-        <w:rPr>
-          <w:sz w:val="36"/>
-          <w:szCs w:val="36"/>
-          <w:rtl w:val="0"/>
-          <w:lang w:val="pt-PT"/>
-        </w:rPr>
-        <w:t>Requisitos da Aplica</w:t>
-      </w:r>
-      <w:r>
-        <w:rPr>
-          <w:sz w:val="36"/>
-          <w:szCs w:val="36"/>
-          <w:rtl w:val="0"/>
-          <w:lang w:val="pt-PT"/>
-        </w:rPr>
-        <w:t>çã</w:t>
-      </w:r>
-      <w:r>
-        <w:rPr>
-          <w:sz w:val="36"/>
-          <w:szCs w:val="36"/>
-          <w:rtl w:val="0"/>
-          <w:lang w:val="pt-PT"/>
-        </w:rPr>
-        <w:t>o Frontend</w:t>
-      </w:r>
-      <w:bookmarkEnd w:id="6"/>
+      <w:r>
+        <w:t>Requisitos da Aplicação Frontend</w:t>
+      </w:r>
     </w:p>
     <w:p>
       <w:pPr>
@@ -1628,17 +1072,9 @@
           <w:rtl w:val="0"/>
         </w:rPr>
       </w:pPr>
-      <w:bookmarkStart w:name="_Toc7" w:id="7"/>
-      <w:r>
-        <w:rPr>
-          <w:sz w:val="36"/>
-          <w:szCs w:val="36"/>
-          <w:rtl w:val="0"/>
-          <w:lang w:val="pt-PT"/>
-        </w:rPr>
+      <w:r>
         <w:t>Funcionais</w:t>
       </w:r>
-      <w:bookmarkEnd w:id="7"/>
     </w:p>
     <w:p>
       <w:pPr>
@@ -1646,6 +1082,7 @@
         <w:spacing w:line="360" w:lineRule="auto"/>
         <w:jc w:val="both"/>
       </w:pPr>
+      <w:r/>
     </w:p>
     <w:p>
       <w:pPr>
@@ -1661,11 +1098,7 @@
         </w:rPr>
       </w:pPr>
       <w:r>
-        <w:rPr>
-          <w:rtl w:val="0"/>
-          <w:lang w:val="pt-PT"/>
-        </w:rPr>
-        <w:t xml:space="preserve">[RF01] XXXXXX </w:t>
+        <w:t xml:space="preserve">[RF01] O sistema deve renderizar um tabuleiro baseado em grade usando o HTML5 Canvas. </w:t>
       </w:r>
     </w:p>
     <w:p>
@@ -1682,11 +1115,7 @@
         </w:rPr>
       </w:pPr>
       <w:r>
-        <w:rPr>
-          <w:rtl w:val="0"/>
-          <w:lang w:val="pt-PT"/>
-        </w:rPr>
-        <w:t xml:space="preserve">[RF02] YYYYYY </w:t>
+        <w:t xml:space="preserve">[RF02] O jogo deve aceitar comandos de movimento através das setas do teclado. </w:t>
       </w:r>
     </w:p>
     <w:p>
@@ -1703,11 +1132,7 @@
         </w:rPr>
       </w:pPr>
       <w:r>
-        <w:rPr>
-          <w:rtl w:val="0"/>
-          <w:lang w:val="pt-PT"/>
-        </w:rPr>
-        <w:t xml:space="preserve">[RF03] VVVVVV </w:t>
+        <w:t xml:space="preserve">[RF03] Inimigos devem possuir IA básica de perseguição ou movimentação randômica. </w:t>
       </w:r>
     </w:p>
     <w:p>
@@ -1724,11 +1149,7 @@
         </w:rPr>
       </w:pPr>
       <w:r>
-        <w:rPr>
-          <w:rtl w:val="0"/>
-          <w:lang w:val="pt-PT"/>
-        </w:rPr>
-        <w:t xml:space="preserve">[RF04] RRRRRR </w:t>
+        <w:t xml:space="preserve">[RF04] O sistema deve incluir um Power-Up (Café) de invencibilidade temporária. </w:t>
       </w:r>
     </w:p>
     <w:p>
@@ -1745,11 +1166,7 @@
         </w:rPr>
       </w:pPr>
       <w:r>
-        <w:rPr>
-          <w:rtl w:val="0"/>
-          <w:lang w:val="pt-PT"/>
-        </w:rPr>
-        <w:t>[RF05] TTTTTT</w:t>
+        <w:t>[RF05] O jogo deve aumentar o nível de dificuldade quando o mapa é zerado.</w:t>
       </w:r>
     </w:p>
     <w:p>
@@ -1766,11 +1183,7 @@
         </w:rPr>
       </w:pPr>
       <w:r>
-        <w:rPr>
-          <w:rtl w:val="0"/>
-          <w:lang w:val="pt-PT"/>
-        </w:rPr>
-        <w:t>[RF06] XXXXXX</w:t>
+        <w:t>[RF06] O jogo deve emitir sons nativos (Web Audio API) durante interações-chave.</w:t>
       </w:r>
     </w:p>
     <w:p>
@@ -1780,6 +1193,7 @@
         <w:ind w:left="2160" w:firstLine="0"/>
         <w:jc w:val="both"/>
       </w:pPr>
+      <w:r/>
     </w:p>
     <w:p>
       <w:pPr>
@@ -1800,35 +1214,9 @@
           <w:rtl w:val="0"/>
         </w:rPr>
       </w:pPr>
-      <w:bookmarkStart w:name="_Toc8" w:id="8"/>
-      <w:r>
-        <w:rPr>
-          <w:sz w:val="36"/>
-          <w:szCs w:val="36"/>
-          <w:rtl w:val="0"/>
-          <w:lang w:val="pt-PT"/>
-        </w:rPr>
-        <w:t>N</w:t>
-      </w:r>
-      <w:r>
-        <w:rPr>
-          <w:sz w:val="36"/>
-          <w:szCs w:val="36"/>
-          <w:rtl w:val="0"/>
-          <w:lang w:val="pt-PT"/>
-        </w:rPr>
-        <w:t>ã</w:t>
-      </w:r>
-      <w:r>
-        <w:rPr>
-          <w:sz w:val="36"/>
-          <w:szCs w:val="36"/>
-          <w:rtl w:val="0"/>
-          <w:lang w:val="pt-PT"/>
-        </w:rPr>
-        <w:t>o-Funcionais</w:t>
-      </w:r>
-      <w:bookmarkEnd w:id="8"/>
+      <w:r>
+        <w:t>Não-Funcionais</w:t>
+      </w:r>
     </w:p>
     <w:p>
       <w:pPr>
@@ -1836,6 +1224,7 @@
         <w:spacing w:line="360" w:lineRule="auto"/>
         <w:jc w:val="both"/>
       </w:pPr>
+      <w:r/>
     </w:p>
     <w:p>
       <w:pPr>
@@ -1851,11 +1240,7 @@
         </w:rPr>
       </w:pPr>
       <w:r>
-        <w:rPr>
-          <w:rtl w:val="0"/>
-          <w:lang w:val="pt-PT"/>
-        </w:rPr>
-        <w:t>[RNF01] XXXXXXX</w:t>
+        <w:t>[RNF01] O jogo deve ser construído usando exclusivamente HTML5, CSS3 e JS Vanilla.</w:t>
       </w:r>
     </w:p>
     <w:p>
@@ -1872,11 +1257,7 @@
         </w:rPr>
       </w:pPr>
       <w:r>
-        <w:rPr>
-          <w:rtl w:val="0"/>
-          <w:lang w:val="pt-PT"/>
-        </w:rPr>
-        <w:t>[RNF02] XXXXXXX</w:t>
+        <w:t>[RNF02] A lógica (GameLogic) deve ser independente do script de renderização.</w:t>
       </w:r>
     </w:p>
     <w:p>
@@ -1893,11 +1274,7 @@
         </w:rPr>
       </w:pPr>
       <w:r>
-        <w:rPr>
-          <w:rtl w:val="0"/>
-          <w:lang w:val="pt-PT"/>
-        </w:rPr>
-        <w:t>[RNF03] XXXXXXX</w:t>
+        <w:t>[RNF03] O frame rate deve manter-se cravado em 60 FPS com requestAnimationFrame.</w:t>
       </w:r>
     </w:p>
     <w:p>
@@ -1914,11 +1291,7 @@
         </w:rPr>
       </w:pPr>
       <w:r>
-        <w:rPr>
-          <w:rtl w:val="0"/>
-          <w:lang w:val="pt-PT"/>
-        </w:rPr>
-        <w:t>[RNF04] XXXXXXX</w:t>
+        <w:t>[RNF04] O jogo não deve depender de conexão externa ou assets baixáveis (Offline-first).</w:t>
       </w:r>
     </w:p>
     <w:p>
@@ -1935,11 +1308,7 @@
         </w:rPr>
       </w:pPr>
       <w:r>
-        <w:rPr>
-          <w:rtl w:val="0"/>
-          <w:lang w:val="pt-PT"/>
-        </w:rPr>
-        <w:t>[RNF05] XXXXXXX</w:t>
+        <w:t>[RNF05] O visual deve possuir estética de Neon gerada nativamente via shadowBlur.</w:t>
       </w:r>
     </w:p>
     <w:p>
@@ -1956,11 +1325,7 @@
         </w:rPr>
       </w:pPr>
       <w:r>
-        <w:rPr>
-          <w:rtl w:val="0"/>
-          <w:lang w:val="pt-PT"/>
-        </w:rPr>
-        <w:t>[RNF06] XXXXXXX</w:t>
+        <w:t>[RNF06] O layout deve utilizar CSS Grid/Flexbox para alinhar o canvas e os menus.</w:t>
       </w:r>
     </w:p>
     <w:p>
@@ -1970,6 +1335,7 @@
         <w:ind w:left="2160" w:firstLine="0"/>
         <w:jc w:val="both"/>
       </w:pPr>
+      <w:r/>
     </w:p>
     <w:p>
       <w:pPr>
@@ -1990,35 +1356,9 @@
           <w:rtl w:val="0"/>
         </w:rPr>
       </w:pPr>
-      <w:bookmarkStart w:name="_Toc9" w:id="9"/>
-      <w:r>
-        <w:rPr>
-          <w:sz w:val="36"/>
-          <w:szCs w:val="36"/>
-          <w:rtl w:val="0"/>
-          <w:lang w:val="pt-PT"/>
-        </w:rPr>
-        <w:t>Regras de Neg</w:t>
-      </w:r>
-      <w:r>
-        <w:rPr>
-          <w:sz w:val="36"/>
-          <w:szCs w:val="36"/>
-          <w:rtl w:val="0"/>
-          <w:lang w:val="pt-PT"/>
-        </w:rPr>
-        <w:t>ó</w:t>
-      </w:r>
-      <w:r>
-        <w:rPr>
-          <w:sz w:val="36"/>
-          <w:szCs w:val="36"/>
-          <w:rtl w:val="0"/>
-          <w:lang w:val="pt-PT"/>
-        </w:rPr>
-        <w:t>cio</w:t>
-      </w:r>
-      <w:bookmarkEnd w:id="9"/>
+      <w:r>
+        <w:t>Regras de Negócio</w:t>
+      </w:r>
     </w:p>
     <w:p>
       <w:pPr>
@@ -2026,6 +1366,7 @@
         <w:spacing w:line="360" w:lineRule="auto"/>
         <w:jc w:val="both"/>
       </w:pPr>
+      <w:r/>
     </w:p>
     <w:p>
       <w:pPr>
@@ -2046,7 +1387,7 @@
         </w:rPr>
       </w:pPr>
       <w:r>
-        <w:t>[RN001] Colisão com Parede: O Jogador e os Inimigos jamais podem ocupar a mesma célula que tenha o valor '1' (Parede) na grade lógica do mapa.</w:t>
+        <w:t>[RN001] Colisão com Paredes Impenetráveis</w:t>
       </w:r>
     </w:p>
     <w:p>
@@ -2056,7 +1397,9 @@
         <w:ind w:left="1080" w:firstLine="338"/>
         <w:jc w:val="both"/>
       </w:pPr>
-      <w:r/>
+      <w:r>
+        <w:t>O Jogador e os Inimigos jamais podem ocupar a mesma célula bidimensional (X,Y) que tenha o valor '1' (Parede) na grade lógica do mapa.</w:t>
+      </w:r>
     </w:p>
     <w:p>
       <w:pPr>
@@ -2077,7 +1420,7 @@
         </w:rPr>
       </w:pPr>
       <w:r>
-        <w:t>[RN002] Morte do Jogador: Se um Inimigo e o Jogador dividirem a mesma coordenada e o Jogador não estiver com estado 'PoweredUp' ativo, a partida é encerrada.</w:t>
+        <w:t>[RN002] Morte do Personagem Sem Buff Ativo</w:t>
       </w:r>
     </w:p>
     <w:p>
@@ -2087,7 +1430,9 @@
         <w:ind w:left="1080" w:firstLine="338"/>
         <w:jc w:val="both"/>
       </w:pPr>
-      <w:r/>
+      <w:r>
+        <w:t>Se um Inimigo e o Jogador dividirem a mesma coordenada e o Jogador não estiver com estado 'PoweredUp' ativo, a partida é encerrada.</w:t>
+      </w:r>
     </w:p>
     <w:p>
       <w:pPr>
@@ -2108,7 +1453,7 @@
         </w:rPr>
       </w:pPr>
       <w:r>
-        <w:t>[RN003] Consumo de Inimigos: Caso o Jogador intercepte um Inimigo com 'PoweredUp' ativo, o Inimigo retorna ao Spawn e um acréscimo de pontuação (+100) é aplicado.</w:t>
+        <w:t>[RN003] Aniquilação de Inimigo com Buff Ativo</w:t>
       </w:r>
     </w:p>
     <w:p>
@@ -2118,7 +1463,9 @@
         <w:ind w:left="1080" w:firstLine="338"/>
         <w:jc w:val="both"/>
       </w:pPr>
-      <w:r/>
+      <w:r>
+        <w:t>Caso o Jogador intercepte um Inimigo com 'PoweredUp' ativo, o Inimigo deve retornar ao seu ponto de nascedouro (Spawn) e um acréscimo de pontuação bônus (+100) será aplicado.</w:t>
+      </w:r>
     </w:p>
     <w:p>
       <w:pPr>
@@ -2139,7 +1486,7 @@
         </w:rPr>
       </w:pPr>
       <w:r>
-        <w:t>[RN005] Túneis Lógicos: Se a coordenada X do Jogador ultrapassar as bordas limite da grade, a posição sofre mutação para o lado oposto (Wraparound).</w:t>
+        <w:t>[RN005] Wrap-around pelas laterais do Tabuleiro</w:t>
       </w:r>
     </w:p>
     <w:p>
@@ -2149,7 +1496,9 @@
         <w:ind w:left="1080" w:firstLine="338"/>
         <w:jc w:val="both"/>
       </w:pPr>
-      <w:r/>
+      <w:r>
+        <w:t>Se a coordenada X do Jogador ultrapassar as bordas limite do Array principal, a posição dele sofrerá uma mutação instantânea para o lado oposto correspondente (Efeito Wraparound).</w:t>
+      </w:r>
     </w:p>
     <w:p>
       <w:pPr>
@@ -2157,6 +1506,7 @@
         <w:spacing w:line="360" w:lineRule="auto"/>
         <w:jc w:val="center"/>
       </w:pPr>
+      <w:r/>
     </w:p>
     <w:p>
       <w:pPr>
@@ -2164,16 +1514,7 @@
         <w:spacing w:line="360" w:lineRule="auto"/>
         <w:jc w:val="center"/>
       </w:pPr>
-      <w:r>
-        <w:rPr>
-          <w:rFonts w:ascii="Arial Unicode MS" w:cs="Arial Unicode MS" w:hAnsi="Arial Unicode MS" w:eastAsia="Arial Unicode MS"/>
-          <w:b w:val="0"/>
-          <w:bCs w:val="0"/>
-          <w:i w:val="0"/>
-          <w:iCs w:val="0"/>
-        </w:rPr>
-        <w:br w:type="page"/>
-      </w:r>
+      <w:r/>
     </w:p>
     <w:p>
       <w:pPr>
@@ -2194,40 +1535,15 @@
           <w:rtl w:val="0"/>
         </w:rPr>
       </w:pPr>
-      <w:bookmarkStart w:name="_Toc10" w:id="10"/>
-      <w:r>
-        <w:rPr>
-          <w:sz w:val="36"/>
-          <w:szCs w:val="36"/>
-          <w:rtl w:val="0"/>
-          <w:lang w:val="pt-PT"/>
-        </w:rPr>
-        <w:t>Anexos (Telas do Jogo, Endere</w:t>
-      </w:r>
-      <w:r>
-        <w:rPr>
-          <w:sz w:val="36"/>
-          <w:szCs w:val="36"/>
-          <w:rtl w:val="0"/>
-          <w:lang w:val="pt-PT"/>
-        </w:rPr>
-        <w:t>ç</w:t>
-      </w:r>
-      <w:r>
-        <w:rPr>
-          <w:sz w:val="36"/>
-          <w:szCs w:val="36"/>
-          <w:rtl w:val="0"/>
-          <w:lang w:val="pt-PT"/>
-        </w:rPr>
-        <w:t>o do GitHub e Documentos Auxiliares)</w:t>
-      </w:r>
-      <w:bookmarkEnd w:id="10"/>
-    </w:p>
-    <w:p>
-      <w:pPr>
-        <w:pStyle w:val="Body Text"/>
-      </w:pPr>
+      <w:r>
+        <w:t>Anexos (Telas do Jogo, Endereço do GitHub e Documentos Auxiliares)</w:t>
+      </w:r>
+    </w:p>
+    <w:p>
+      <w:pPr>
+        <w:pStyle w:val="Body Text"/>
+      </w:pPr>
+      <w:r/>
     </w:p>
     <w:p>
       <w:pPr>
@@ -2235,56 +1551,22 @@
         <w:ind w:firstLine="709"/>
       </w:pPr>
       <w:r>
-        <w:rPr>
-          <w:rtl w:val="0"/>
-          <w:lang w:val="pt-PT"/>
-        </w:rPr>
-        <w:t>Endere</w:t>
-      </w:r>
-      <w:r>
-        <w:rPr>
-          <w:rtl w:val="0"/>
-          <w:lang w:val="pt-PT"/>
-        </w:rPr>
-        <w:t>ç</w:t>
-      </w:r>
-      <w:r>
-        <w:rPr>
-          <w:rtl w:val="0"/>
-          <w:lang w:val="pt-PT"/>
-        </w:rPr>
-        <w:t>o do Github:  https://github.com/?????</w:t>
-      </w:r>
-    </w:p>
-    <w:p>
-      <w:pPr>
-        <w:pStyle w:val="Body Text"/>
-      </w:pPr>
-    </w:p>
-    <w:p>
-      <w:pPr>
-        <w:pStyle w:val="Body Text"/>
-      </w:pPr>
-      <w:r>
-        <w:rPr>
-          <w:rtl w:val="0"/>
-        </w:rPr>
+        <w:t>Endereço do Github:  https://github.com/kauaxp77/Jogo_frontend</w:t>
+      </w:r>
+    </w:p>
+    <w:p>
+      <w:pPr>
+        <w:pStyle w:val="Body Text"/>
+      </w:pPr>
+      <w:r/>
+    </w:p>
+    <w:p>
+      <w:pPr>
+        <w:pStyle w:val="Body Text"/>
+      </w:pPr>
+      <w:r>
         <w:tab/>
-        <w:t>7.1 - Telas do Jogo com explica</w:t>
-      </w:r>
-      <w:r>
-        <w:rPr>
-          <w:rtl w:val="0"/>
-          <w:lang w:val="pt-PT"/>
-        </w:rPr>
-        <w:t>çõ</w:t>
-      </w:r>
-      <w:r>
-        <w:rPr>
-          <w:rtl w:val="0"/>
-          <w:lang w:val="pt-PT"/>
-        </w:rPr>
-        <w:t>es de cada fase do jogo.</w:t>
+        <w:t>7.1 - Telas do Jogo com explicações de cada fase do jogo.</w:t>
       </w:r>
     </w:p>
     <w:p>
@@ -2294,11 +1576,13 @@
           <w:u w:val="single"/>
         </w:rPr>
       </w:pPr>
-    </w:p>
-    <w:p>
-      <w:pPr>
-        <w:pStyle w:val="Body Text"/>
-      </w:pPr>
+      <w:r/>
+    </w:p>
+    <w:p>
+      <w:pPr>
+        <w:pStyle w:val="Body Text"/>
+      </w:pPr>
+      <w:r/>
     </w:p>
     <w:p>
       <w:pPr>
@@ -2307,7 +1591,6 @@
       <w:r>
         <w:tab/>
       </w:r>
-      <w:r/>
     </w:p>
     <w:sectPr>
       <w:headerReference w:type="default" r:id="rId8"/>

</xml_diff>